<commit_message>
Add and update fiction drafts and notes
Added numerous new fiction draft and note files, including various .docx, .md, .txt, and image files. Updated and renamed several existing files for consistency, and removed obsolete drafts. These changes improve organization and expand the collection of fiction materials.
</commit_message>
<xml_diff>
--- a/aeirn/fiction/notes/.whiteboard.docx
+++ b/aeirn/fiction/notes/.whiteboard.docx
@@ -5,6 +5,10 @@
     <w:p>
       <w:pPr>
         <w:pStyle w:val="NoSpacing"/>
+        <w:rPr>
+          <w:rFonts w:ascii="Montserrat" w:hAnsi="Montserrat"/>
+          <w:sz w:val="24"/>
+        </w:rPr>
       </w:pPr>
     </w:p>
     <w:sectPr>
@@ -17,12 +21,112 @@
 </w:document>
 </file>
 
+<file path=word/numbering.xml><?xml version="1.0" encoding="utf-8"?>
+<w:numbering xmlns:wpc="http://schemas.microsoft.com/office/word/2010/wordprocessingCanvas" xmlns:cx="http://schemas.microsoft.com/office/drawing/2014/chartex" xmlns:cx1="http://schemas.microsoft.com/office/drawing/2015/9/8/chartex" xmlns:cx2="http://schemas.microsoft.com/office/drawing/2015/10/21/chartex" xmlns:cx3="http://schemas.microsoft.com/office/drawing/2016/5/9/chartex" xmlns:cx4="http://schemas.microsoft.com/office/drawing/2016/5/10/chartex" xmlns:cx5="http://schemas.microsoft.com/office/drawing/2016/5/11/chartex" xmlns:cx6="http://schemas.microsoft.com/office/drawing/2016/5/12/chartex" xmlns:cx7="http://schemas.microsoft.com/office/drawing/2016/5/13/chartex" xmlns:cx8="http://schemas.microsoft.com/office/drawing/2016/5/14/chartex" xmlns:mc="http://schemas.openxmlformats.org/markup-compatibility/2006" xmlns:aink="http://schemas.microsoft.com/office/drawing/2016/ink" xmlns:am3d="http://schemas.microsoft.com/office/drawing/2017/model3d" xmlns:o="urn:schemas-microsoft-com:office:office" xmlns:oel="http://schemas.microsoft.com/office/2019/extlst" xmlns:r="http://schemas.openxmlformats.org/officeDocument/2006/relationships" xmlns:m="http://schemas.openxmlformats.org/officeDocument/2006/math" xmlns:v="urn:schemas-microsoft-com:vml" xmlns:wp14="http://schemas.microsoft.com/office/word/2010/wordprocessingDrawing" xmlns:wp="http://schemas.openxmlformats.org/drawingml/2006/wordprocessingDrawing" xmlns:w10="urn:schemas-microsoft-com:office:word" xmlns:w="http://schemas.openxmlformats.org/wordprocessingml/2006/main" xmlns:w14="http://schemas.microsoft.com/office/word/2010/wordml" xmlns:w15="http://schemas.microsoft.com/office/word/2012/wordml" xmlns:w16cex="http://schemas.microsoft.com/office/word/2018/wordml/cex" xmlns:w16cid="http://schemas.microsoft.com/office/word/2016/wordml/cid" xmlns:w16="http://schemas.microsoft.com/office/word/2018/wordml" xmlns:w16du="http://schemas.microsoft.com/office/word/2023/wordml/word16du" xmlns:w16sdtdh="http://schemas.microsoft.com/office/word/2020/wordml/sdtdatahash" xmlns:w16sdtfl="http://schemas.microsoft.com/office/word/2024/wordml/sdtformatlock" xmlns:w16se="http://schemas.microsoft.com/office/word/2015/wordml/symex" xmlns:wpg="http://schemas.microsoft.com/office/word/2010/wordprocessingGroup" xmlns:wpi="http://schemas.microsoft.com/office/word/2010/wordprocessingInk" xmlns:wne="http://schemas.microsoft.com/office/word/2006/wordml" xmlns:wps="http://schemas.microsoft.com/office/word/2010/wordprocessingShape" mc:Ignorable="w14 w15 w16se w16cid w16 w16cex w16sdtdh w16sdtfl w16du wp14">
+  <w:abstractNum w:abstractNumId="0" w15:restartNumberingAfterBreak="0">
+    <w:nsid w:val="FFFFFFFB"/>
+    <w:multiLevelType w:val="multilevel"/>
+    <w:tmpl w:val="80A499BA"/>
+    <w:lvl w:ilvl="0">
+      <w:start w:val="1"/>
+      <w:numFmt w:val="cardinalText"/>
+      <w:lvlText w:val="Chapter %1 "/>
+      <w:legacy w:legacy="1" w:legacySpace="144" w:legacyIndent="0"/>
+      <w:lvlJc w:val="left"/>
+    </w:lvl>
+    <w:lvl w:ilvl="1">
+      <w:start w:val="1"/>
+      <w:numFmt w:val="none"/>
+      <w:pStyle w:val="Heading2"/>
+      <w:suff w:val="nothing"/>
+      <w:lvlText w:val=""/>
+      <w:lvlJc w:val="left"/>
+    </w:lvl>
+    <w:lvl w:ilvl="2">
+      <w:start w:val="1"/>
+      <w:numFmt w:val="none"/>
+      <w:suff w:val="nothing"/>
+      <w:lvlText w:val=""/>
+      <w:lvlJc w:val="left"/>
+    </w:lvl>
+    <w:lvl w:ilvl="3">
+      <w:start w:val="1"/>
+      <w:numFmt w:val="none"/>
+      <w:pStyle w:val="Heading4"/>
+      <w:suff w:val="nothing"/>
+      <w:lvlText w:val=""/>
+      <w:lvlJc w:val="left"/>
+    </w:lvl>
+    <w:lvl w:ilvl="4">
+      <w:start w:val="1"/>
+      <w:numFmt w:val="none"/>
+      <w:pStyle w:val="Heading5"/>
+      <w:suff w:val="nothing"/>
+      <w:lvlText w:val=""/>
+      <w:lvlJc w:val="left"/>
+    </w:lvl>
+    <w:lvl w:ilvl="5">
+      <w:start w:val="1"/>
+      <w:numFmt w:val="none"/>
+      <w:pStyle w:val="Heading6"/>
+      <w:suff w:val="nothing"/>
+      <w:lvlText w:val=""/>
+      <w:lvlJc w:val="left"/>
+    </w:lvl>
+    <w:lvl w:ilvl="6">
+      <w:start w:val="1"/>
+      <w:numFmt w:val="none"/>
+      <w:suff w:val="nothing"/>
+      <w:lvlText w:val=""/>
+      <w:lvlJc w:val="left"/>
+    </w:lvl>
+    <w:lvl w:ilvl="7">
+      <w:start w:val="1"/>
+      <w:numFmt w:val="none"/>
+      <w:suff w:val="nothing"/>
+      <w:lvlText w:val=""/>
+      <w:lvlJc w:val="left"/>
+    </w:lvl>
+    <w:lvl w:ilvl="8">
+      <w:start w:val="1"/>
+      <w:numFmt w:val="none"/>
+      <w:suff w:val="nothing"/>
+      <w:lvlText w:val=""/>
+      <w:lvlJc w:val="left"/>
+    </w:lvl>
+  </w:abstractNum>
+  <w:num w:numId="1" w16cid:durableId="1859806221">
+    <w:abstractNumId w:val="0"/>
+  </w:num>
+  <w:num w:numId="2" w16cid:durableId="307169056">
+    <w:abstractNumId w:val="0"/>
+  </w:num>
+  <w:num w:numId="3" w16cid:durableId="1982342437">
+    <w:abstractNumId w:val="0"/>
+  </w:num>
+  <w:num w:numId="4" w16cid:durableId="938755116">
+    <w:abstractNumId w:val="0"/>
+  </w:num>
+  <w:num w:numId="5" w16cid:durableId="73743977">
+    <w:abstractNumId w:val="0"/>
+  </w:num>
+  <w:num w:numId="6" w16cid:durableId="2021740318">
+    <w:abstractNumId w:val="0"/>
+  </w:num>
+  <w:num w:numId="7" w16cid:durableId="1919092134">
+    <w:abstractNumId w:val="0"/>
+  </w:num>
+</w:numbering>
+</file>
+
 <file path=word/styles.xml><?xml version="1.0" encoding="utf-8"?>
 <w:styles xmlns:mc="http://schemas.openxmlformats.org/markup-compatibility/2006" xmlns:r="http://schemas.openxmlformats.org/officeDocument/2006/relationships" xmlns:w="http://schemas.openxmlformats.org/wordprocessingml/2006/main" xmlns:w14="http://schemas.microsoft.com/office/word/2010/wordml" xmlns:w15="http://schemas.microsoft.com/office/word/2012/wordml" xmlns:w16cex="http://schemas.microsoft.com/office/word/2018/wordml/cex" xmlns:w16cid="http://schemas.microsoft.com/office/word/2016/wordml/cid" xmlns:w16="http://schemas.microsoft.com/office/word/2018/wordml" xmlns:w16du="http://schemas.microsoft.com/office/word/2023/wordml/word16du" xmlns:w16sdtdh="http://schemas.microsoft.com/office/word/2020/wordml/sdtdatahash" xmlns:w16sdtfl="http://schemas.microsoft.com/office/word/2024/wordml/sdtformatlock" xmlns:w16se="http://schemas.microsoft.com/office/word/2015/wordml/symex" mc:Ignorable="w14 w15 w16se w16cid w16 w16cex w16sdtdh w16sdtfl w16du">
   <w:docDefaults>
     <w:rPrDefault>
       <w:rPr>
-        <w:rFonts w:ascii="Aptos" w:eastAsia="Aptos" w:hAnsi="Aptos" w:cs="Times New Roman"/>
+        <w:rFonts w:asciiTheme="minorHAnsi" w:eastAsiaTheme="minorHAnsi" w:hAnsiTheme="minorHAnsi" w:cstheme="minorBidi"/>
+        <w:sz w:val="22"/>
+        <w:szCs w:val="22"/>
         <w:lang w:val="en-US" w:eastAsia="en-US" w:bidi="ar-SA"/>
       </w:rPr>
     </w:rPrDefault>
@@ -30,15 +134,15 @@
   </w:docDefaults>
   <w:latentStyles w:defLockedState="0" w:defUIPriority="99" w:defSemiHidden="0" w:defUnhideWhenUsed="0" w:defQFormat="0" w:count="376">
     <w:lsdException w:name="Normal" w:uiPriority="0" w:qFormat="1"/>
-    <w:lsdException w:name="heading 1" w:uiPriority="9" w:qFormat="1"/>
-    <w:lsdException w:name="heading 2" w:semiHidden="1" w:uiPriority="9" w:unhideWhenUsed="1" w:qFormat="1"/>
-    <w:lsdException w:name="heading 3" w:semiHidden="1" w:uiPriority="9" w:unhideWhenUsed="1" w:qFormat="1"/>
-    <w:lsdException w:name="heading 4" w:semiHidden="1" w:uiPriority="9" w:unhideWhenUsed="1" w:qFormat="1"/>
-    <w:lsdException w:name="heading 5" w:semiHidden="1" w:uiPriority="9" w:unhideWhenUsed="1" w:qFormat="1"/>
-    <w:lsdException w:name="heading 6" w:semiHidden="1" w:uiPriority="9" w:unhideWhenUsed="1" w:qFormat="1"/>
-    <w:lsdException w:name="heading 7" w:semiHidden="1" w:uiPriority="9" w:unhideWhenUsed="1" w:qFormat="1"/>
-    <w:lsdException w:name="heading 8" w:semiHidden="1" w:uiPriority="9" w:unhideWhenUsed="1" w:qFormat="1"/>
-    <w:lsdException w:name="heading 9" w:semiHidden="1" w:uiPriority="9" w:unhideWhenUsed="1" w:qFormat="1"/>
+    <w:lsdException w:name="heading 1" w:uiPriority="0" w:qFormat="1"/>
+    <w:lsdException w:name="heading 2" w:semiHidden="1" w:uiPriority="0" w:unhideWhenUsed="1" w:qFormat="1"/>
+    <w:lsdException w:name="heading 3" w:semiHidden="1" w:uiPriority="0" w:unhideWhenUsed="1" w:qFormat="1"/>
+    <w:lsdException w:name="heading 4" w:semiHidden="1" w:uiPriority="0" w:unhideWhenUsed="1" w:qFormat="1"/>
+    <w:lsdException w:name="heading 5" w:semiHidden="1" w:uiPriority="0" w:unhideWhenUsed="1" w:qFormat="1"/>
+    <w:lsdException w:name="heading 6" w:semiHidden="1" w:uiPriority="0" w:unhideWhenUsed="1" w:qFormat="1"/>
+    <w:lsdException w:name="heading 7" w:semiHidden="1" w:uiPriority="0" w:unhideWhenUsed="1" w:qFormat="1"/>
+    <w:lsdException w:name="heading 8" w:semiHidden="1" w:uiPriority="0" w:unhideWhenUsed="1" w:qFormat="1"/>
+    <w:lsdException w:name="heading 9" w:semiHidden="1" w:uiPriority="0" w:unhideWhenUsed="1" w:qFormat="1"/>
     <w:lsdException w:name="index 1" w:semiHidden="1" w:unhideWhenUsed="1"/>
     <w:lsdException w:name="index 2" w:semiHidden="1" w:unhideWhenUsed="1"/>
     <w:lsdException w:name="index 3" w:semiHidden="1" w:unhideWhenUsed="1"/>
@@ -409,39 +513,33 @@
   <w:style w:type="paragraph" w:default="1" w:styleId="Normal">
     <w:name w:val="Normal"/>
     <w:qFormat/>
-    <w:rsid w:val="00195E39"/>
-    <w:pPr>
-      <w:widowControl w:val="0"/>
-      <w:suppressAutoHyphens/>
-      <w:spacing w:after="120" w:line="360" w:lineRule="auto"/>
-      <w:jc w:val="both"/>
-    </w:pPr>
-    <w:rPr>
-      <w:rFonts w:ascii="Calibri" w:eastAsia="Lucida Sans Unicode" w:hAnsi="Calibri" w:cs="Calibri"/>
-      <w:szCs w:val="22"/>
+    <w:rsid w:val="00293F07"/>
+    <w:pPr>
+      <w:spacing w:after="240" w:line="276" w:lineRule="auto"/>
+    </w:pPr>
+    <w:rPr>
+      <w:rFonts w:eastAsia="Lucida Sans Unicode" w:cstheme="minorHAnsi"/>
+      <w:sz w:val="28"/>
+      <w:szCs w:val="28"/>
     </w:rPr>
   </w:style>
   <w:style w:type="paragraph" w:styleId="Heading1">
     <w:name w:val="heading 1"/>
-    <w:basedOn w:val="Normal"/>
+    <w:basedOn w:val="NoSpacing"/>
     <w:next w:val="Normal"/>
     <w:link w:val="Heading1Char"/>
-    <w:autoRedefine/>
-    <w:uiPriority w:val="9"/>
-    <w:qFormat/>
-    <w:rsid w:val="00195E39"/>
+    <w:qFormat/>
+    <w:rsid w:val="00293F07"/>
     <w:pPr>
       <w:keepNext/>
-      <w:keepLines/>
-      <w:spacing w:after="0"/>
-      <w:contextualSpacing/>
-      <w:jc w:val="left"/>
+      <w:spacing w:before="240" w:after="60" w:line="240" w:lineRule="auto"/>
       <w:outlineLvl w:val="0"/>
     </w:pPr>
     <w:rPr>
-      <w:rFonts w:ascii="Abadi" w:eastAsiaTheme="majorEastAsia" w:hAnsi="Abadi" w:cstheme="majorBidi"/>
-      <w:sz w:val="32"/>
-      <w:szCs w:val="32"/>
+      <w:rFonts w:eastAsiaTheme="majorEastAsia"/>
+      <w:b/>
+      <w:kern w:val="28"/>
+      <w:sz w:val="56"/>
     </w:rPr>
   </w:style>
   <w:style w:type="paragraph" w:styleId="Heading2">
@@ -449,18 +547,19 @@
     <w:basedOn w:val="Heading1"/>
     <w:next w:val="Normal"/>
     <w:link w:val="Heading2Char"/>
-    <w:uiPriority w:val="9"/>
-    <w:semiHidden/>
-    <w:unhideWhenUsed/>
-    <w:qFormat/>
-    <w:rsid w:val="00195E39"/>
-    <w:pPr>
-      <w:spacing w:before="40"/>
+    <w:qFormat/>
+    <w:rsid w:val="00293F07"/>
+    <w:pPr>
+      <w:numPr>
+        <w:ilvl w:val="1"/>
+        <w:numId w:val="7"/>
+      </w:numPr>
       <w:outlineLvl w:val="1"/>
     </w:pPr>
     <w:rPr>
-      <w:sz w:val="28"/>
-      <w:szCs w:val="28"/>
+      <w:rFonts w:asciiTheme="majorHAnsi" w:hAnsiTheme="majorHAnsi"/>
+      <w:sz w:val="48"/>
+      <w:szCs w:val="48"/>
     </w:rPr>
   </w:style>
   <w:style w:type="paragraph" w:styleId="Heading3">
@@ -468,19 +567,13 @@
     <w:basedOn w:val="Heading2"/>
     <w:next w:val="Normal"/>
     <w:link w:val="Heading3Char"/>
-    <w:autoRedefine/>
-    <w:uiPriority w:val="9"/>
-    <w:unhideWhenUsed/>
-    <w:qFormat/>
-    <w:rsid w:val="00195E39"/>
-    <w:pPr>
-      <w:spacing w:before="0"/>
+    <w:qFormat/>
+    <w:rsid w:val="00293F07"/>
+    <w:pPr>
       <w:outlineLvl w:val="2"/>
     </w:pPr>
     <w:rPr>
-      <w:bCs/>
-      <w:sz w:val="24"/>
-      <w:szCs w:val="24"/>
+      <w:sz w:val="40"/>
     </w:rPr>
   </w:style>
   <w:style w:type="paragraph" w:styleId="Heading4">
@@ -488,16 +581,16 @@
     <w:basedOn w:val="Heading3"/>
     <w:next w:val="Normal"/>
     <w:link w:val="Heading4Char"/>
-    <w:autoRedefine/>
-    <w:uiPriority w:val="9"/>
-    <w:unhideWhenUsed/>
-    <w:qFormat/>
-    <w:rsid w:val="00195E39"/>
-    <w:pPr>
+    <w:qFormat/>
+    <w:rsid w:val="00293F07"/>
+    <w:pPr>
+      <w:numPr>
+        <w:ilvl w:val="3"/>
+      </w:numPr>
       <w:outlineLvl w:val="3"/>
     </w:pPr>
     <w:rPr>
-      <w:sz w:val="22"/>
+      <w:sz w:val="32"/>
     </w:rPr>
   </w:style>
   <w:style w:type="paragraph" w:styleId="Heading5">
@@ -505,17 +598,16 @@
     <w:basedOn w:val="Heading4"/>
     <w:next w:val="Normal"/>
     <w:link w:val="Heading5Char"/>
-    <w:autoRedefine/>
-    <w:uiPriority w:val="9"/>
-    <w:unhideWhenUsed/>
-    <w:qFormat/>
-    <w:rsid w:val="00195E39"/>
-    <w:pPr>
+    <w:qFormat/>
+    <w:rsid w:val="00293F07"/>
+    <w:pPr>
+      <w:numPr>
+        <w:ilvl w:val="4"/>
+      </w:numPr>
       <w:outlineLvl w:val="4"/>
     </w:pPr>
     <w:rPr>
-      <w:rFonts w:ascii="Abadi Extra Light" w:hAnsi="Abadi Extra Light"/>
-      <w:bCs w:val="0"/>
+      <w:sz w:val="28"/>
     </w:rPr>
   </w:style>
   <w:style w:type="paragraph" w:styleId="Heading6">
@@ -523,81 +615,70 @@
     <w:basedOn w:val="Heading5"/>
     <w:next w:val="Normal"/>
     <w:link w:val="Heading6Char"/>
-    <w:autoRedefine/>
-    <w:uiPriority w:val="9"/>
-    <w:semiHidden/>
-    <w:unhideWhenUsed/>
-    <w:qFormat/>
-    <w:rsid w:val="00195E39"/>
-    <w:pPr>
+    <w:qFormat/>
+    <w:rsid w:val="00293F07"/>
+    <w:pPr>
+      <w:numPr>
+        <w:ilvl w:val="5"/>
+      </w:numPr>
       <w:outlineLvl w:val="5"/>
     </w:pPr>
     <w:rPr>
-      <w:rFonts w:eastAsiaTheme="minorEastAsia" w:cstheme="minorBidi"/>
-      <w:b/>
       <w:bCs/>
-      <w:sz w:val="20"/>
+      <w:sz w:val="24"/>
+      <w:szCs w:val="24"/>
+      <w:u w:val="single"/>
     </w:rPr>
   </w:style>
   <w:style w:type="paragraph" w:styleId="Heading7">
     <w:name w:val="heading 7"/>
-    <w:basedOn w:val="Normal"/>
+    <w:basedOn w:val="Heading6"/>
     <w:next w:val="Normal"/>
     <w:link w:val="Heading7Char"/>
-    <w:uiPriority w:val="9"/>
-    <w:semiHidden/>
-    <w:unhideWhenUsed/>
-    <w:qFormat/>
-    <w:rsid w:val="00195E39"/>
-    <w:pPr>
-      <w:spacing w:before="240" w:after="60"/>
+    <w:qFormat/>
+    <w:rsid w:val="00293F07"/>
+    <w:pPr>
+      <w:keepNext w:val="0"/>
+      <w:numPr>
+        <w:ilvl w:val="0"/>
+        <w:numId w:val="0"/>
+      </w:numPr>
       <w:outlineLvl w:val="6"/>
     </w:pPr>
     <w:rPr>
-      <w:rFonts w:asciiTheme="minorHAnsi" w:eastAsiaTheme="minorEastAsia" w:hAnsiTheme="minorHAnsi" w:cstheme="minorBidi"/>
-      <w:sz w:val="24"/>
-      <w:szCs w:val="24"/>
+      <w:b w:val="0"/>
+      <w:kern w:val="0"/>
     </w:rPr>
   </w:style>
   <w:style w:type="paragraph" w:styleId="Heading8">
     <w:name w:val="heading 8"/>
-    <w:basedOn w:val="Normal"/>
+    <w:basedOn w:val="Heading6"/>
     <w:next w:val="Normal"/>
     <w:link w:val="Heading8Char"/>
-    <w:uiPriority w:val="9"/>
-    <w:semiHidden/>
-    <w:unhideWhenUsed/>
-    <w:qFormat/>
-    <w:rsid w:val="00195E39"/>
-    <w:pPr>
-      <w:spacing w:before="240" w:after="60"/>
+    <w:qFormat/>
+    <w:rsid w:val="00293F07"/>
+    <w:pPr>
       <w:outlineLvl w:val="7"/>
     </w:pPr>
     <w:rPr>
-      <w:rFonts w:asciiTheme="minorHAnsi" w:eastAsiaTheme="minorEastAsia" w:hAnsiTheme="minorHAnsi" w:cstheme="minorBidi"/>
       <w:i/>
       <w:iCs/>
-      <w:sz w:val="24"/>
-      <w:szCs w:val="24"/>
+      <w:u w:val="none"/>
     </w:rPr>
   </w:style>
   <w:style w:type="paragraph" w:styleId="Heading9">
     <w:name w:val="heading 9"/>
-    <w:basedOn w:val="Normal"/>
+    <w:basedOn w:val="Heading8"/>
     <w:next w:val="Normal"/>
     <w:link w:val="Heading9Char"/>
-    <w:uiPriority w:val="9"/>
-    <w:semiHidden/>
-    <w:unhideWhenUsed/>
-    <w:qFormat/>
-    <w:rsid w:val="00195E39"/>
-    <w:pPr>
-      <w:spacing w:before="240" w:after="60"/>
+    <w:qFormat/>
+    <w:rsid w:val="00293F07"/>
+    <w:pPr>
       <w:outlineLvl w:val="8"/>
     </w:pPr>
     <w:rPr>
-      <w:rFonts w:asciiTheme="majorHAnsi" w:eastAsiaTheme="majorEastAsia" w:hAnsiTheme="majorHAnsi" w:cstheme="majorBidi"/>
-      <w:sz w:val="22"/>
+      <w:b w:val="0"/>
+      <w:bCs w:val="0"/>
     </w:rPr>
   </w:style>
   <w:style w:type="character" w:default="1" w:styleId="DefaultParagraphFont">
@@ -631,106 +712,104 @@
     <w:name w:val="Heading 3 Char"/>
     <w:basedOn w:val="DefaultParagraphFont"/>
     <w:link w:val="Heading3"/>
-    <w:uiPriority w:val="9"/>
-    <w:rsid w:val="00195E39"/>
-    <w:rPr>
-      <w:rFonts w:ascii="Abadi" w:eastAsiaTheme="majorEastAsia" w:hAnsi="Abadi" w:cstheme="majorBidi"/>
-      <w:bCs/>
-      <w:sz w:val="24"/>
-      <w:szCs w:val="24"/>
+    <w:rsid w:val="00293F07"/>
+    <w:rPr>
+      <w:rFonts w:asciiTheme="majorHAnsi" w:eastAsiaTheme="majorEastAsia" w:hAnsiTheme="majorHAnsi" w:cstheme="minorHAnsi"/>
+      <w:b/>
+      <w:kern w:val="28"/>
+      <w:sz w:val="40"/>
+      <w:szCs w:val="48"/>
     </w:rPr>
   </w:style>
   <w:style w:type="character" w:customStyle="1" w:styleId="Heading2Char">
     <w:name w:val="Heading 2 Char"/>
+    <w:basedOn w:val="DefaultParagraphFont"/>
     <w:link w:val="Heading2"/>
-    <w:uiPriority w:val="9"/>
-    <w:semiHidden/>
-    <w:rsid w:val="00195E39"/>
-    <w:rPr>
-      <w:rFonts w:ascii="Abadi" w:eastAsiaTheme="majorEastAsia" w:hAnsi="Abadi" w:cstheme="majorBidi"/>
-      <w:sz w:val="28"/>
-      <w:szCs w:val="28"/>
+    <w:rsid w:val="00293F07"/>
+    <w:rPr>
+      <w:rFonts w:asciiTheme="majorHAnsi" w:eastAsiaTheme="majorEastAsia" w:hAnsiTheme="majorHAnsi" w:cstheme="minorHAnsi"/>
+      <w:b/>
+      <w:kern w:val="28"/>
+      <w:sz w:val="48"/>
+      <w:szCs w:val="48"/>
     </w:rPr>
   </w:style>
   <w:style w:type="character" w:customStyle="1" w:styleId="Heading4Char">
     <w:name w:val="Heading 4 Char"/>
     <w:basedOn w:val="DefaultParagraphFont"/>
     <w:link w:val="Heading4"/>
-    <w:uiPriority w:val="9"/>
-    <w:rsid w:val="00195E39"/>
-    <w:rPr>
-      <w:rFonts w:ascii="Abadi" w:eastAsiaTheme="majorEastAsia" w:hAnsi="Abadi" w:cstheme="majorBidi"/>
-      <w:bCs/>
-      <w:sz w:val="22"/>
-      <w:szCs w:val="24"/>
+    <w:rsid w:val="00293F07"/>
+    <w:rPr>
+      <w:rFonts w:asciiTheme="majorHAnsi" w:eastAsiaTheme="majorEastAsia" w:hAnsiTheme="majorHAnsi" w:cstheme="minorHAnsi"/>
+      <w:b/>
+      <w:kern w:val="28"/>
+      <w:sz w:val="32"/>
+      <w:szCs w:val="48"/>
     </w:rPr>
   </w:style>
   <w:style w:type="character" w:customStyle="1" w:styleId="Heading1Char">
     <w:name w:val="Heading 1 Char"/>
+    <w:basedOn w:val="DefaultParagraphFont"/>
     <w:link w:val="Heading1"/>
-    <w:uiPriority w:val="9"/>
-    <w:rsid w:val="00195E39"/>
-    <w:rPr>
-      <w:rFonts w:ascii="Abadi" w:eastAsiaTheme="majorEastAsia" w:hAnsi="Abadi" w:cstheme="majorBidi"/>
-      <w:sz w:val="32"/>
-      <w:szCs w:val="32"/>
+    <w:rsid w:val="00293F07"/>
+    <w:rPr>
+      <w:rFonts w:eastAsiaTheme="majorEastAsia" w:cstheme="minorHAnsi"/>
+      <w:b/>
+      <w:kern w:val="28"/>
+      <w:sz w:val="56"/>
+      <w:szCs w:val="28"/>
     </w:rPr>
   </w:style>
   <w:style w:type="paragraph" w:styleId="Title">
     <w:name w:val="Title"/>
-    <w:basedOn w:val="Normal"/>
+    <w:basedOn w:val="NoSpacing"/>
     <w:next w:val="Normal"/>
     <w:link w:val="TitleChar"/>
     <w:uiPriority w:val="10"/>
     <w:qFormat/>
-    <w:rsid w:val="00195E39"/>
-    <w:pPr>
-      <w:spacing w:after="0" w:line="240" w:lineRule="auto"/>
-      <w:contextualSpacing/>
-      <w:jc w:val="left"/>
-    </w:pPr>
-    <w:rPr>
-      <w:rFonts w:ascii="Abadi" w:eastAsiaTheme="majorEastAsia" w:hAnsi="Abadi" w:cstheme="majorBidi"/>
-      <w:b/>
+    <w:rsid w:val="00293F07"/>
+    <w:pPr>
+      <w:spacing w:line="240" w:lineRule="auto"/>
+    </w:pPr>
+    <w:rPr>
+      <w:rFonts w:asciiTheme="majorHAnsi" w:eastAsiaTheme="majorEastAsia" w:hAnsiTheme="majorHAnsi" w:cstheme="majorBidi"/>
+      <w:b/>
+      <w:bCs/>
       <w:spacing w:val="-10"/>
       <w:kern w:val="28"/>
-      <w:sz w:val="56"/>
-      <w:szCs w:val="56"/>
+      <w:sz w:val="72"/>
+      <w:szCs w:val="72"/>
     </w:rPr>
   </w:style>
   <w:style w:type="character" w:customStyle="1" w:styleId="TitleChar">
     <w:name w:val="Title Char"/>
+    <w:basedOn w:val="DefaultParagraphFont"/>
     <w:link w:val="Title"/>
     <w:uiPriority w:val="10"/>
-    <w:rsid w:val="00195E39"/>
-    <w:rPr>
-      <w:rFonts w:ascii="Abadi" w:eastAsiaTheme="majorEastAsia" w:hAnsi="Abadi" w:cstheme="majorBidi"/>
-      <w:b/>
+    <w:rsid w:val="00293F07"/>
+    <w:rPr>
+      <w:rFonts w:asciiTheme="majorHAnsi" w:eastAsiaTheme="majorEastAsia" w:hAnsiTheme="majorHAnsi" w:cstheme="majorBidi"/>
+      <w:b/>
+      <w:bCs/>
       <w:spacing w:val="-10"/>
       <w:kern w:val="28"/>
-      <w:sz w:val="56"/>
-      <w:szCs w:val="56"/>
+      <w:sz w:val="72"/>
+      <w:szCs w:val="72"/>
     </w:rPr>
   </w:style>
   <w:style w:type="paragraph" w:styleId="Subtitle">
     <w:name w:val="Subtitle"/>
-    <w:basedOn w:val="Heading1"/>
+    <w:basedOn w:val="Title"/>
     <w:next w:val="Normal"/>
     <w:link w:val="SubtitleChar"/>
     <w:uiPriority w:val="11"/>
     <w:qFormat/>
-    <w:rsid w:val="00195E39"/>
-    <w:pPr>
-      <w:spacing w:after="120" w:line="240" w:lineRule="auto"/>
-      <w:outlineLvl w:val="1"/>
-    </w:pPr>
-    <w:rPr>
-      <w:rFonts w:ascii="Abadi Extra Light" w:hAnsi="Abadi Extra Light"/>
-      <w:b/>
-      <w:bCs/>
-      <w:color w:val="808080" w:themeColor="background1" w:themeShade="80"/>
-      <w:sz w:val="24"/>
-      <w:szCs w:val="24"/>
+    <w:rsid w:val="00293F07"/>
+    <w:rPr>
+      <w:b w:val="0"/>
+      <w:bCs w:val="0"/>
+      <w:color w:val="7F7F7F" w:themeColor="text1" w:themeTint="80"/>
+      <w:vertAlign w:val="superscript"/>
     </w:rPr>
   </w:style>
   <w:style w:type="character" w:customStyle="1" w:styleId="SubtitleChar">
@@ -738,28 +817,30 @@
     <w:basedOn w:val="DefaultParagraphFont"/>
     <w:link w:val="Subtitle"/>
     <w:uiPriority w:val="11"/>
-    <w:rsid w:val="00195E39"/>
-    <w:rPr>
-      <w:rFonts w:ascii="Abadi Extra Light" w:eastAsiaTheme="majorEastAsia" w:hAnsi="Abadi Extra Light" w:cstheme="majorBidi"/>
-      <w:b/>
-      <w:bCs/>
-      <w:color w:val="808080" w:themeColor="background1" w:themeShade="80"/>
-      <w:sz w:val="24"/>
-      <w:szCs w:val="24"/>
+    <w:rsid w:val="00293F07"/>
+    <w:rPr>
+      <w:rFonts w:asciiTheme="majorHAnsi" w:eastAsiaTheme="majorEastAsia" w:hAnsiTheme="majorHAnsi" w:cstheme="majorBidi"/>
+      <w:color w:val="7F7F7F" w:themeColor="text1" w:themeTint="80"/>
+      <w:spacing w:val="-10"/>
+      <w:kern w:val="28"/>
+      <w:sz w:val="72"/>
+      <w:szCs w:val="72"/>
+      <w:vertAlign w:val="superscript"/>
     </w:rPr>
   </w:style>
   <w:style w:type="character" w:styleId="SubtleEmphasis">
     <w:name w:val="Subtle Emphasis"/>
-    <w:basedOn w:val="DefaultFontNormal"/>
+    <w:basedOn w:val="Emphasis"/>
     <w:uiPriority w:val="19"/>
     <w:qFormat/>
-    <w:rsid w:val="002D295C"/>
-    <w:rPr>
-      <w:rFonts w:ascii="Humnst777 BT" w:hAnsi="Humnst777 BT"/>
+    <w:rsid w:val="00293F07"/>
+    <w:rPr>
+      <w:rFonts w:asciiTheme="minorHAnsi" w:hAnsiTheme="minorHAnsi" w:cs="Calibri Light"/>
       <w:i/>
       <w:iCs/>
-      <w:color w:val="404040" w:themeColor="text1" w:themeTint="BF"/>
-      <w:sz w:val="16"/>
+      <w:color w:val="7F7F7F" w:themeColor="text1" w:themeTint="80"/>
+      <w:sz w:val="28"/>
+      <w:szCs w:val="28"/>
     </w:rPr>
   </w:style>
   <w:style w:type="character" w:customStyle="1" w:styleId="DefaultFontNormal">
@@ -773,42 +854,41 @@
   </w:style>
   <w:style w:type="character" w:styleId="Emphasis">
     <w:name w:val="Emphasis"/>
-    <w:basedOn w:val="SubtleEmphasis"/>
     <w:uiPriority w:val="20"/>
     <w:qFormat/>
-    <w:rsid w:val="002D295C"/>
-    <w:rPr>
-      <w:rFonts w:ascii="Humnst777 BT" w:hAnsi="Humnst777 BT"/>
+    <w:rsid w:val="00293F07"/>
+    <w:rPr>
+      <w:rFonts w:asciiTheme="minorHAnsi" w:hAnsiTheme="minorHAnsi" w:cstheme="minorHAnsi"/>
       <w:i/>
       <w:iCs/>
-      <w:color w:val="404040" w:themeColor="text1" w:themeTint="BF"/>
-      <w:sz w:val="16"/>
+      <w:sz w:val="28"/>
+      <w:szCs w:val="28"/>
     </w:rPr>
   </w:style>
   <w:style w:type="character" w:styleId="IntenseEmphasis">
     <w:name w:val="Intense Emphasis"/>
-    <w:basedOn w:val="DefaultParagraphFont"/>
+    <w:basedOn w:val="Emphasis"/>
     <w:uiPriority w:val="21"/>
     <w:qFormat/>
-    <w:rsid w:val="00195E39"/>
-    <w:rPr>
-      <w:b/>
+    <w:rsid w:val="00293F07"/>
+    <w:rPr>
+      <w:rFonts w:asciiTheme="minorHAnsi" w:hAnsiTheme="minorHAnsi" w:cstheme="minorHAnsi"/>
+      <w:b/>
+      <w:bCs/>
       <w:i/>
       <w:iCs/>
-      <w:color w:val="auto"/>
+      <w:sz w:val="28"/>
+      <w:szCs w:val="28"/>
     </w:rPr>
   </w:style>
   <w:style w:type="character" w:styleId="Strong">
     <w:name w:val="Strong"/>
-    <w:basedOn w:val="DefaultFontNormal"/>
     <w:uiPriority w:val="22"/>
     <w:qFormat/>
-    <w:rsid w:val="002D295C"/>
-    <w:rPr>
-      <w:rFonts w:ascii="Humnst777 BT" w:hAnsi="Humnst777 BT"/>
+    <w:rsid w:val="00293F07"/>
+    <w:rPr>
       <w:b/>
       <w:bCs/>
-      <w:sz w:val="16"/>
     </w:rPr>
   </w:style>
   <w:style w:type="paragraph" w:styleId="Quote">
@@ -818,16 +898,20 @@
     <w:link w:val="QuoteChar"/>
     <w:uiPriority w:val="29"/>
     <w:qFormat/>
-    <w:rsid w:val="00195E39"/>
-    <w:pPr>
-      <w:spacing w:before="200" w:after="160"/>
-      <w:ind w:left="864" w:right="864"/>
-      <w:jc w:val="center"/>
-    </w:pPr>
-    <w:rPr>
-      <w:i/>
-      <w:iCs/>
-      <w:color w:val="404040" w:themeColor="text1" w:themeTint="BF"/>
+    <w:rsid w:val="00293F07"/>
+    <w:pPr>
+      <w:keepLines/>
+      <w:pageBreakBefore/>
+      <w:pBdr>
+        <w:left w:val="single" w:sz="4" w:space="7" w:color="auto"/>
+      </w:pBdr>
+      <w:spacing w:before="120" w:after="120"/>
+      <w:ind w:left="360"/>
+      <w:contextualSpacing/>
+      <w:mirrorIndents/>
+    </w:pPr>
+    <w:rPr>
+      <w:rFonts w:eastAsiaTheme="minorHAnsi"/>
     </w:rPr>
   </w:style>
   <w:style w:type="character" w:customStyle="1" w:styleId="QuoteChar">
@@ -835,36 +919,29 @@
     <w:basedOn w:val="DefaultParagraphFont"/>
     <w:link w:val="Quote"/>
     <w:uiPriority w:val="29"/>
-    <w:rsid w:val="00195E39"/>
-    <w:rPr>
-      <w:rFonts w:ascii="Calibri" w:eastAsia="Lucida Sans Unicode" w:hAnsi="Calibri" w:cs="Calibri"/>
-      <w:i/>
-      <w:iCs/>
-      <w:color w:val="404040" w:themeColor="text1" w:themeTint="BF"/>
-      <w:szCs w:val="22"/>
+    <w:rsid w:val="00293F07"/>
+    <w:rPr>
+      <w:rFonts w:cstheme="minorHAnsi"/>
+      <w:sz w:val="28"/>
+      <w:szCs w:val="28"/>
     </w:rPr>
   </w:style>
   <w:style w:type="paragraph" w:styleId="IntenseQuote">
     <w:name w:val="Intense Quote"/>
-    <w:basedOn w:val="Normal"/>
+    <w:basedOn w:val="Quote"/>
     <w:next w:val="Normal"/>
     <w:link w:val="IntenseQuoteChar"/>
-    <w:autoRedefine/>
     <w:uiPriority w:val="30"/>
     <w:qFormat/>
-    <w:rsid w:val="00195E39"/>
+    <w:rsid w:val="00293F07"/>
     <w:pPr>
       <w:pBdr>
-        <w:top w:val="single" w:sz="4" w:space="10" w:color="auto"/>
-        <w:bottom w:val="single" w:sz="4" w:space="10" w:color="auto"/>
+        <w:left w:val="single" w:sz="18" w:space="7" w:color="auto"/>
       </w:pBdr>
-      <w:spacing w:before="360" w:after="360"/>
-      <w:ind w:left="864" w:right="864"/>
-      <w:jc w:val="center"/>
-    </w:pPr>
-    <w:rPr>
-      <w:i/>
-      <w:iCs/>
+    </w:pPr>
+    <w:rPr>
+      <w:b/>
+      <w:bCs/>
     </w:rPr>
   </w:style>
   <w:style w:type="character" w:customStyle="1" w:styleId="IntenseQuoteChar">
@@ -872,57 +949,54 @@
     <w:basedOn w:val="DefaultParagraphFont"/>
     <w:link w:val="IntenseQuote"/>
     <w:uiPriority w:val="30"/>
-    <w:rsid w:val="00195E39"/>
-    <w:rPr>
-      <w:rFonts w:ascii="Calibri" w:eastAsia="Lucida Sans Unicode" w:hAnsi="Calibri" w:cs="Calibri"/>
-      <w:i/>
-      <w:iCs/>
-      <w:szCs w:val="22"/>
+    <w:rsid w:val="00293F07"/>
+    <w:rPr>
+      <w:rFonts w:cstheme="minorHAnsi"/>
+      <w:b/>
+      <w:bCs/>
+      <w:sz w:val="28"/>
+      <w:szCs w:val="28"/>
     </w:rPr>
   </w:style>
   <w:style w:type="character" w:styleId="SubtleReference">
     <w:name w:val="Subtle Reference"/>
-    <w:basedOn w:val="DefaultFontNormal"/>
     <w:uiPriority w:val="31"/>
     <w:qFormat/>
-    <w:rsid w:val="002D295C"/>
-    <w:rPr>
-      <w:rFonts w:ascii="Humnst777 BT" w:hAnsi="Humnst777 BT"/>
-      <w:smallCaps/>
-      <w:color w:val="5A5A5A" w:themeColor="text1" w:themeTint="A5"/>
-      <w:sz w:val="16"/>
+    <w:rsid w:val="00293F07"/>
+    <w:rPr>
+      <w:caps/>
+      <w:color w:val="7F7F7F" w:themeColor="text1" w:themeTint="80"/>
+      <w:sz w:val="22"/>
+      <w:szCs w:val="22"/>
     </w:rPr>
   </w:style>
   <w:style w:type="character" w:styleId="IntenseReference">
     <w:name w:val="Intense Reference"/>
-    <w:basedOn w:val="DefaultParagraphFont"/>
+    <w:basedOn w:val="SubtleReference"/>
     <w:uiPriority w:val="32"/>
     <w:qFormat/>
-    <w:rsid w:val="00195E39"/>
+    <w:rsid w:val="00293F07"/>
     <w:rPr>
       <w:b/>
       <w:bCs/>
-      <w:smallCaps/>
-      <w:color w:val="auto"/>
-      <w:spacing w:val="5"/>
+      <w:caps/>
+      <w:color w:val="7F7F7F" w:themeColor="text1" w:themeTint="80"/>
+      <w:sz w:val="22"/>
+      <w:szCs w:val="22"/>
     </w:rPr>
   </w:style>
   <w:style w:type="character" w:styleId="BookTitle">
     <w:name w:val="Book Title"/>
-    <w:basedOn w:val="TitleChar"/>
+    <w:basedOn w:val="DefaultParagraphFont"/>
     <w:uiPriority w:val="33"/>
     <w:qFormat/>
-    <w:rsid w:val="002D295C"/>
-    <w:rPr>
-      <w:rFonts w:ascii="Abadi" w:eastAsiaTheme="majorEastAsia" w:hAnsi="Abadi" w:cstheme="majorBidi"/>
+    <w:rsid w:val="00293F07"/>
+    <w:rPr>
       <w:b/>
       <w:bCs/>
       <w:i/>
       <w:iCs/>
       <w:spacing w:val="5"/>
-      <w:kern w:val="28"/>
-      <w:sz w:val="56"/>
-      <w:szCs w:val="56"/>
     </w:rPr>
   </w:style>
   <w:style w:type="paragraph" w:styleId="ListParagraph">
@@ -930,61 +1004,65 @@
     <w:basedOn w:val="Normal"/>
     <w:uiPriority w:val="34"/>
     <w:qFormat/>
-    <w:rsid w:val="00195E39"/>
+    <w:rsid w:val="00293F07"/>
     <w:pPr>
       <w:ind w:left="720"/>
+      <w:contextualSpacing/>
     </w:pPr>
   </w:style>
   <w:style w:type="character" w:customStyle="1" w:styleId="Heading5Char">
     <w:name w:val="Heading 5 Char"/>
     <w:basedOn w:val="DefaultParagraphFont"/>
     <w:link w:val="Heading5"/>
-    <w:uiPriority w:val="9"/>
-    <w:rsid w:val="00195E39"/>
-    <w:rPr>
-      <w:rFonts w:ascii="Abadi Extra Light" w:eastAsiaTheme="majorEastAsia" w:hAnsi="Abadi Extra Light" w:cstheme="majorBidi"/>
-      <w:sz w:val="22"/>
-      <w:szCs w:val="24"/>
+    <w:rsid w:val="00293F07"/>
+    <w:rPr>
+      <w:rFonts w:asciiTheme="majorHAnsi" w:eastAsiaTheme="majorEastAsia" w:hAnsiTheme="majorHAnsi" w:cstheme="minorHAnsi"/>
+      <w:b/>
+      <w:kern w:val="28"/>
+      <w:sz w:val="28"/>
+      <w:szCs w:val="48"/>
     </w:rPr>
   </w:style>
   <w:style w:type="character" w:customStyle="1" w:styleId="Heading6Char">
     <w:name w:val="Heading 6 Char"/>
     <w:basedOn w:val="DefaultParagraphFont"/>
     <w:link w:val="Heading6"/>
-    <w:uiPriority w:val="9"/>
-    <w:semiHidden/>
-    <w:rsid w:val="00195E39"/>
-    <w:rPr>
-      <w:rFonts w:ascii="Abadi Extra Light" w:eastAsiaTheme="minorEastAsia" w:hAnsi="Abadi Extra Light" w:cstheme="minorBidi"/>
+    <w:rsid w:val="00293F07"/>
+    <w:rPr>
+      <w:rFonts w:asciiTheme="majorHAnsi" w:eastAsiaTheme="majorEastAsia" w:hAnsiTheme="majorHAnsi" w:cstheme="minorHAnsi"/>
       <w:b/>
       <w:bCs/>
+      <w:kern w:val="28"/>
+      <w:sz w:val="24"/>
       <w:szCs w:val="24"/>
+      <w:u w:val="single"/>
     </w:rPr>
   </w:style>
   <w:style w:type="character" w:customStyle="1" w:styleId="Heading7Char">
     <w:name w:val="Heading 7 Char"/>
     <w:basedOn w:val="DefaultParagraphFont"/>
     <w:link w:val="Heading7"/>
-    <w:uiPriority w:val="9"/>
-    <w:semiHidden/>
-    <w:rsid w:val="00195E39"/>
-    <w:rPr>
-      <w:rFonts w:asciiTheme="minorHAnsi" w:eastAsiaTheme="minorEastAsia" w:hAnsiTheme="minorHAnsi" w:cstheme="minorBidi"/>
+    <w:rsid w:val="00293F07"/>
+    <w:rPr>
+      <w:rFonts w:asciiTheme="majorHAnsi" w:eastAsiaTheme="majorEastAsia" w:hAnsiTheme="majorHAnsi" w:cstheme="minorHAnsi"/>
+      <w:bCs/>
       <w:sz w:val="24"/>
       <w:szCs w:val="24"/>
+      <w:u w:val="single"/>
     </w:rPr>
   </w:style>
   <w:style w:type="character" w:customStyle="1" w:styleId="Heading8Char">
     <w:name w:val="Heading 8 Char"/>
     <w:basedOn w:val="DefaultParagraphFont"/>
     <w:link w:val="Heading8"/>
-    <w:uiPriority w:val="9"/>
-    <w:semiHidden/>
-    <w:rsid w:val="00195E39"/>
-    <w:rPr>
-      <w:rFonts w:asciiTheme="minorHAnsi" w:eastAsiaTheme="minorEastAsia" w:hAnsiTheme="minorHAnsi" w:cstheme="minorBidi"/>
+    <w:rsid w:val="00293F07"/>
+    <w:rPr>
+      <w:rFonts w:asciiTheme="majorHAnsi" w:eastAsiaTheme="majorEastAsia" w:hAnsiTheme="majorHAnsi" w:cstheme="minorHAnsi"/>
+      <w:b/>
+      <w:bCs/>
       <w:i/>
       <w:iCs/>
+      <w:kern w:val="28"/>
       <w:sz w:val="24"/>
       <w:szCs w:val="24"/>
     </w:rPr>
@@ -993,20 +1071,20 @@
     <w:name w:val="Heading 9 Char"/>
     <w:basedOn w:val="DefaultParagraphFont"/>
     <w:link w:val="Heading9"/>
-    <w:uiPriority w:val="9"/>
-    <w:semiHidden/>
-    <w:rsid w:val="00195E39"/>
-    <w:rPr>
-      <w:rFonts w:asciiTheme="majorHAnsi" w:eastAsiaTheme="majorEastAsia" w:hAnsiTheme="majorHAnsi" w:cstheme="majorBidi"/>
-      <w:sz w:val="22"/>
-      <w:szCs w:val="22"/>
+    <w:rsid w:val="00293F07"/>
+    <w:rPr>
+      <w:rFonts w:asciiTheme="majorHAnsi" w:eastAsiaTheme="majorEastAsia" w:hAnsiTheme="majorHAnsi" w:cstheme="minorHAnsi"/>
+      <w:i/>
+      <w:iCs/>
+      <w:kern w:val="28"/>
+      <w:sz w:val="24"/>
+      <w:szCs w:val="24"/>
     </w:rPr>
   </w:style>
   <w:style w:type="paragraph" w:customStyle="1" w:styleId="Indent-01NS">
     <w:name w:val="Indent-01 NS"/>
     <w:basedOn w:val="NoSpacing"/>
     <w:link w:val="Indent-01NSChar"/>
-    <w:qFormat/>
     <w:rsid w:val="00195E39"/>
     <w:pPr>
       <w:ind w:left="720"/>
@@ -1019,6 +1097,7 @@
     <w:rsid w:val="00195E39"/>
     <w:rPr>
       <w:rFonts w:ascii="Calibri" w:eastAsia="Lucida Sans Unicode" w:hAnsi="Calibri" w:cs="Calibri"/>
+      <w:sz w:val="28"/>
       <w:szCs w:val="22"/>
     </w:rPr>
   </w:style>
@@ -1028,16 +1107,15 @@
     <w:link w:val="NoSpacingChar"/>
     <w:uiPriority w:val="1"/>
     <w:qFormat/>
-    <w:rsid w:val="00195E39"/>
-    <w:pPr>
-      <w:spacing w:after="0" w:line="276" w:lineRule="auto"/>
+    <w:rsid w:val="00293F07"/>
+    <w:pPr>
+      <w:spacing w:after="0"/>
     </w:pPr>
   </w:style>
   <w:style w:type="paragraph" w:customStyle="1" w:styleId="Indent-02NS">
     <w:name w:val="Indent-02 NS"/>
     <w:basedOn w:val="Indent-01NS"/>
     <w:link w:val="Indent-02NSChar"/>
-    <w:qFormat/>
     <w:rsid w:val="00195E39"/>
     <w:pPr>
       <w:ind w:left="1440"/>
@@ -1050,6 +1128,7 @@
     <w:rsid w:val="00195E39"/>
     <w:rPr>
       <w:rFonts w:ascii="Calibri" w:eastAsia="Lucida Sans Unicode" w:hAnsi="Calibri" w:cs="Calibri"/>
+      <w:sz w:val="28"/>
       <w:szCs w:val="22"/>
     </w:rPr>
   </w:style>
@@ -1057,7 +1136,6 @@
     <w:name w:val="Indent-03 NS"/>
     <w:basedOn w:val="Indent-02NS"/>
     <w:link w:val="Indent-03NSChar"/>
-    <w:qFormat/>
     <w:rsid w:val="00195E39"/>
     <w:pPr>
       <w:ind w:left="2160"/>
@@ -1070,6 +1148,7 @@
     <w:rsid w:val="00195E39"/>
     <w:rPr>
       <w:rFonts w:ascii="Calibri" w:eastAsia="Lucida Sans Unicode" w:hAnsi="Calibri" w:cs="Calibri"/>
+      <w:sz w:val="28"/>
       <w:szCs w:val="22"/>
     </w:rPr>
   </w:style>
@@ -1077,7 +1156,6 @@
     <w:name w:val="Indent-04 NS"/>
     <w:basedOn w:val="Indent-03NS"/>
     <w:link w:val="Indent-04NSChar"/>
-    <w:qFormat/>
     <w:rsid w:val="00195E39"/>
     <w:pPr>
       <w:ind w:left="2880"/>
@@ -1090,6 +1168,7 @@
     <w:rsid w:val="00195E39"/>
     <w:rPr>
       <w:rFonts w:ascii="Calibri" w:eastAsia="Lucida Sans Unicode" w:hAnsi="Calibri" w:cs="Calibri"/>
+      <w:sz w:val="28"/>
       <w:szCs w:val="22"/>
     </w:rPr>
   </w:style>
@@ -1097,7 +1176,6 @@
     <w:name w:val="Normal (Body)"/>
     <w:basedOn w:val="Normal"/>
     <w:link w:val="NormalBodyChar"/>
-    <w:qFormat/>
     <w:rsid w:val="00195E39"/>
     <w:pPr>
       <w:ind w:firstLine="720"/>
@@ -1117,7 +1195,6 @@
     <w:name w:val="No Spacing (Body)"/>
     <w:basedOn w:val="NoSpacing"/>
     <w:link w:val="NoSpacingBodyChar"/>
-    <w:qFormat/>
     <w:rsid w:val="00195E39"/>
     <w:pPr>
       <w:ind w:firstLine="720"/>
@@ -1130,6 +1207,7 @@
     <w:rsid w:val="00195E39"/>
     <w:rPr>
       <w:rFonts w:ascii="Calibri" w:eastAsia="Lucida Sans Unicode" w:hAnsi="Calibri" w:cs="Calibri"/>
+      <w:sz w:val="28"/>
       <w:szCs w:val="22"/>
     </w:rPr>
   </w:style>
@@ -1140,8 +1218,137 @@
     <w:uiPriority w:val="1"/>
     <w:rsid w:val="00195E39"/>
     <w:rPr>
-      <w:rFonts w:ascii="Calibri" w:eastAsia="Lucida Sans Unicode" w:hAnsi="Calibri" w:cs="Calibri"/>
-      <w:szCs w:val="22"/>
+      <w:rFonts w:eastAsia="Lucida Sans Unicode" w:cstheme="minorHAnsi"/>
+      <w:sz w:val="28"/>
+      <w:szCs w:val="28"/>
+    </w:rPr>
+  </w:style>
+  <w:style w:type="paragraph" w:customStyle="1" w:styleId="Subheading1">
+    <w:name w:val="Subheading 1"/>
+    <w:basedOn w:val="Heading1"/>
+    <w:next w:val="Normal"/>
+    <w:link w:val="Subheading1Char"/>
+    <w:qFormat/>
+    <w:rsid w:val="00293F07"/>
+    <w:pPr>
+      <w:spacing w:before="0" w:after="0"/>
+      <w:contextualSpacing/>
+    </w:pPr>
+    <w:rPr>
+      <w:rFonts w:asciiTheme="majorHAnsi" w:eastAsiaTheme="minorHAnsi" w:hAnsiTheme="majorHAnsi"/>
+      <w:sz w:val="48"/>
+      <w:szCs w:val="48"/>
+      <w:vertAlign w:val="superscript"/>
+    </w:rPr>
+  </w:style>
+  <w:style w:type="character" w:customStyle="1" w:styleId="Subheading1Char">
+    <w:name w:val="Subheading 1 Char"/>
+    <w:basedOn w:val="DefaultParagraphFont"/>
+    <w:link w:val="Subheading1"/>
+    <w:rsid w:val="00293F07"/>
+    <w:rPr>
+      <w:rFonts w:asciiTheme="majorHAnsi" w:hAnsiTheme="majorHAnsi" w:cstheme="minorHAnsi"/>
+      <w:b/>
+      <w:kern w:val="28"/>
+      <w:sz w:val="48"/>
+      <w:szCs w:val="48"/>
+      <w:vertAlign w:val="superscript"/>
+    </w:rPr>
+  </w:style>
+  <w:style w:type="paragraph" w:customStyle="1" w:styleId="Subheading2">
+    <w:name w:val="Subheading 2"/>
+    <w:basedOn w:val="Subheading1"/>
+    <w:next w:val="Normal"/>
+    <w:link w:val="Subheading2Char"/>
+    <w:qFormat/>
+    <w:rsid w:val="00293F07"/>
+  </w:style>
+  <w:style w:type="character" w:customStyle="1" w:styleId="Subheading2Char">
+    <w:name w:val="Subheading 2 Char"/>
+    <w:basedOn w:val="Subheading1Char"/>
+    <w:link w:val="Subheading2"/>
+    <w:rsid w:val="00293F07"/>
+    <w:rPr>
+      <w:rFonts w:asciiTheme="majorHAnsi" w:hAnsiTheme="majorHAnsi" w:cstheme="minorHAnsi"/>
+      <w:b/>
+      <w:kern w:val="28"/>
+      <w:sz w:val="48"/>
+      <w:szCs w:val="48"/>
+      <w:vertAlign w:val="superscript"/>
+    </w:rPr>
+  </w:style>
+  <w:style w:type="paragraph" w:customStyle="1" w:styleId="Subheading3">
+    <w:name w:val="Subheading 3"/>
+    <w:basedOn w:val="Subheading2"/>
+    <w:next w:val="Normal"/>
+    <w:link w:val="Subheading3Char"/>
+    <w:qFormat/>
+    <w:rsid w:val="00293F07"/>
+    <w:rPr>
+      <w:sz w:val="40"/>
+      <w:szCs w:val="40"/>
+    </w:rPr>
+  </w:style>
+  <w:style w:type="character" w:customStyle="1" w:styleId="Subheading3Char">
+    <w:name w:val="Subheading 3 Char"/>
+    <w:basedOn w:val="Subheading2Char"/>
+    <w:link w:val="Subheading3"/>
+    <w:rsid w:val="00293F07"/>
+    <w:rPr>
+      <w:rFonts w:asciiTheme="majorHAnsi" w:hAnsiTheme="majorHAnsi" w:cstheme="minorHAnsi"/>
+      <w:b/>
+      <w:kern w:val="28"/>
+      <w:sz w:val="40"/>
+      <w:szCs w:val="40"/>
+      <w:vertAlign w:val="superscript"/>
+    </w:rPr>
+  </w:style>
+  <w:style w:type="paragraph" w:customStyle="1" w:styleId="Suptitle">
+    <w:name w:val="Suptitle"/>
+    <w:basedOn w:val="Subtitle"/>
+    <w:link w:val="SuptitleChar"/>
+    <w:qFormat/>
+    <w:rsid w:val="00293F07"/>
+    <w:pPr>
+      <w:spacing w:before="240"/>
+    </w:pPr>
+    <w:rPr>
+      <w:vertAlign w:val="subscript"/>
+    </w:rPr>
+  </w:style>
+  <w:style w:type="character" w:customStyle="1" w:styleId="SuptitleChar">
+    <w:name w:val="Suptitle Char"/>
+    <w:basedOn w:val="SubtitleChar"/>
+    <w:link w:val="Suptitle"/>
+    <w:rsid w:val="00293F07"/>
+    <w:rPr>
+      <w:rFonts w:asciiTheme="majorHAnsi" w:eastAsiaTheme="majorEastAsia" w:hAnsiTheme="majorHAnsi" w:cstheme="majorBidi"/>
+      <w:color w:val="7F7F7F" w:themeColor="text1" w:themeTint="80"/>
+      <w:spacing w:val="-10"/>
+      <w:kern w:val="28"/>
+      <w:sz w:val="72"/>
+      <w:szCs w:val="72"/>
+      <w:vertAlign w:val="subscript"/>
+    </w:rPr>
+  </w:style>
+  <w:style w:type="paragraph" w:styleId="Caption">
+    <w:name w:val="caption"/>
+    <w:basedOn w:val="Normal"/>
+    <w:next w:val="Normal"/>
+    <w:uiPriority w:val="35"/>
+    <w:semiHidden/>
+    <w:unhideWhenUsed/>
+    <w:qFormat/>
+    <w:rsid w:val="00293F07"/>
+    <w:pPr>
+      <w:spacing w:after="200"/>
+    </w:pPr>
+    <w:rPr>
+      <w:rFonts w:eastAsia="Times New Roman"/>
+      <w:i/>
+      <w:iCs/>
+      <w:color w:val="0E2841" w:themeColor="text2"/>
+      <w:szCs w:val="18"/>
     </w:rPr>
   </w:style>
 </w:styles>

</xml_diff>